<commit_message>
feat: add CyberGuard project and update resume
</commit_message>
<xml_diff>
--- a/public/Subrat_Kumar_Sahoo_Resume.docx
+++ b/public/Subrat_Kumar_Sahoo_Resume.docx
@@ -20,7 +20,7 @@
     </w:p>
     <w:p>
       <w:pPr>
-        <w:spacing w:after="100"/>
+        <w:spacing w:after="60"/>
       </w:pPr>
       <w:r>
         <w:rPr>
@@ -72,7 +72,7 @@
     </w:p>
     <w:p>
       <w:pPr>
-        <w:spacing w:after="200"/>
+        <w:spacing w:after="60"/>
       </w:pPr>
       <w:r>
         <w:rPr>
@@ -146,7 +146,7 @@
         <w:pBdr>
           <w:bottom w:val="single" w:color="1F6F3F" w:sz="6" w:space="2"/>
         </w:pBdr>
-        <w:spacing w:after="90" w:before="190"/>
+        <w:spacing w:after="60" w:before="100"/>
       </w:pPr>
       <w:r>
         <w:rPr>
@@ -162,7 +162,7 @@
     </w:p>
     <w:p>
       <w:pPr>
-        <w:spacing w:after="100"/>
+        <w:spacing w:after="60"/>
       </w:pPr>
       <w:r>
         <w:rPr>
@@ -179,7 +179,7 @@
         <w:pBdr>
           <w:bottom w:val="single" w:color="1F6F3F" w:sz="6" w:space="2"/>
         </w:pBdr>
-        <w:spacing w:after="90" w:before="190"/>
+        <w:spacing w:after="60" w:before="100"/>
       </w:pPr>
       <w:r>
         <w:rPr>
@@ -198,7 +198,7 @@
         <w:tabs>
           <w:tab w:val="right" w:pos="10512"/>
         </w:tabs>
-        <w:spacing w:after="20" w:before="140"/>
+        <w:spacing w:after="20" w:before="100"/>
       </w:pPr>
       <w:r>
         <w:rPr>
@@ -241,7 +241,7 @@
           <w:ilvl w:val="0"/>
           <w:numId w:val="1"/>
         </w:numPr>
-        <w:spacing w:after="40"/>
+        <w:spacing w:after="20"/>
       </w:pPr>
       <w:r>
         <w:rPr>
@@ -260,7 +260,7 @@
           <w:ilvl w:val="0"/>
           <w:numId w:val="1"/>
         </w:numPr>
-        <w:spacing w:after="40"/>
+        <w:spacing w:after="20"/>
       </w:pPr>
       <w:r>
         <w:rPr>
@@ -279,7 +279,7 @@
           <w:ilvl w:val="0"/>
           <w:numId w:val="1"/>
         </w:numPr>
-        <w:spacing w:after="40"/>
+        <w:spacing w:after="20"/>
       </w:pPr>
       <w:r>
         <w:rPr>
@@ -298,7 +298,7 @@
           <w:ilvl w:val="0"/>
           <w:numId w:val="1"/>
         </w:numPr>
-        <w:spacing w:after="40"/>
+        <w:spacing w:after="20"/>
       </w:pPr>
       <w:r>
         <w:rPr>
@@ -315,7 +315,7 @@
         <w:tabs>
           <w:tab w:val="right" w:pos="10512"/>
         </w:tabs>
-        <w:spacing w:after="20" w:before="140"/>
+        <w:spacing w:after="20" w:before="100"/>
       </w:pPr>
       <w:r>
         <w:rPr>
@@ -358,7 +358,7 @@
           <w:ilvl w:val="0"/>
           <w:numId w:val="1"/>
         </w:numPr>
-        <w:spacing w:after="40"/>
+        <w:spacing w:after="20"/>
       </w:pPr>
       <w:r>
         <w:rPr>
@@ -377,7 +377,7 @@
           <w:ilvl w:val="0"/>
           <w:numId w:val="1"/>
         </w:numPr>
-        <w:spacing w:after="40"/>
+        <w:spacing w:after="20"/>
       </w:pPr>
       <w:r>
         <w:rPr>
@@ -396,7 +396,7 @@
           <w:ilvl w:val="0"/>
           <w:numId w:val="1"/>
         </w:numPr>
-        <w:spacing w:after="40"/>
+        <w:spacing w:after="20"/>
       </w:pPr>
       <w:r>
         <w:rPr>
@@ -415,7 +415,7 @@
           <w:ilvl w:val="0"/>
           <w:numId w:val="1"/>
         </w:numPr>
-        <w:spacing w:after="40"/>
+        <w:spacing w:after="20"/>
       </w:pPr>
       <w:r>
         <w:rPr>
@@ -432,7 +432,7 @@
         <w:tabs>
           <w:tab w:val="right" w:pos="10512"/>
         </w:tabs>
-        <w:spacing w:after="20" w:before="140"/>
+        <w:spacing w:after="20" w:before="100"/>
       </w:pPr>
       <w:r>
         <w:rPr>
@@ -475,7 +475,7 @@
           <w:ilvl w:val="0"/>
           <w:numId w:val="1"/>
         </w:numPr>
-        <w:spacing w:after="40"/>
+        <w:spacing w:after="20"/>
       </w:pPr>
       <w:r>
         <w:rPr>
@@ -494,7 +494,7 @@
           <w:ilvl w:val="0"/>
           <w:numId w:val="1"/>
         </w:numPr>
-        <w:spacing w:after="40"/>
+        <w:spacing w:after="20"/>
       </w:pPr>
       <w:r>
         <w:rPr>
@@ -513,7 +513,7 @@
           <w:ilvl w:val="0"/>
           <w:numId w:val="1"/>
         </w:numPr>
-        <w:spacing w:after="40"/>
+        <w:spacing w:after="20"/>
       </w:pPr>
       <w:r>
         <w:rPr>
@@ -532,7 +532,7 @@
           <w:ilvl w:val="0"/>
           <w:numId w:val="1"/>
         </w:numPr>
-        <w:spacing w:after="40"/>
+        <w:spacing w:after="20"/>
       </w:pPr>
       <w:r>
         <w:rPr>
@@ -549,7 +549,7 @@
         <w:pBdr>
           <w:bottom w:val="single" w:color="1F6F3F" w:sz="6" w:space="2"/>
         </w:pBdr>
-        <w:spacing w:after="90" w:before="190"/>
+        <w:spacing w:after="60" w:before="100"/>
       </w:pPr>
       <w:r>
         <w:rPr>
@@ -565,7 +565,230 @@
     </w:p>
     <w:p>
       <w:pPr>
-        <w:spacing w:after="10" w:before="140"/>
+        <w:spacing w:before="100" w:after="10"/>
+      </w:pPr>
+      <w:r>
+        <w:rPr>
+          <w:rFonts w:ascii="Calibri" w:hAnsi="Calibri"/>
+          <w:b/>
+          <w:color w:val="1A1A1A"/>
+          <w:sz w:val="21"/>
+        </w:rPr>
+        <w:t>CyberGuard: AI-Powered Threat Detection, Investigation &amp; Response Platform</w:t>
+      </w:r>
+    </w:p>
+    <w:p>
+      <w:pPr>
+        <w:spacing w:after="25"/>
+      </w:pPr>
+      <w:r>
+        <w:rPr>
+          <w:rFonts w:ascii="Calibri" w:hAnsi="Calibri"/>
+          <w:i/>
+          <w:color w:val="444444"/>
+          <w:sz w:val="19"/>
+        </w:rPr>
+        <w:t>August 2026 – October 2026  |  Team VisionCraft  |  Role: Team Lead &amp; AI/ML Lead</w:t>
+      </w:r>
+    </w:p>
+    <w:p>
+      <w:pPr>
+        <w:spacing w:after="25"/>
+      </w:pPr>
+      <w:r>
+        <w:rPr>
+          <w:rFonts w:ascii="Calibri" w:hAnsi="Calibri"/>
+          <w:b/>
+          <w:i/>
+          <w:color w:val="444444"/>
+          <w:sz w:val="19"/>
+        </w:rPr>
+        <w:t xml:space="preserve">Tech: </w:t>
+      </w:r>
+      <w:r>
+        <w:rPr>
+          <w:rFonts w:ascii="Calibri" w:hAnsi="Calibri"/>
+          <w:i/>
+          <w:color w:val="444444"/>
+          <w:sz w:val="19"/>
+        </w:rPr>
+        <w:t>Python, FastAPI, Scikit-learn, LightGBM, PyTorch, PostgreSQL, React, React Native, Pydantic</w:t>
+      </w:r>
+    </w:p>
+    <w:p>
+      <w:pPr>
+        <w:spacing w:after="25"/>
+      </w:pPr>
+      <w:r>
+        <w:rPr>
+          <w:rFonts w:ascii="Calibri" w:hAnsi="Calibri"/>
+          <w:color w:val="444444"/>
+          <w:sz w:val="19"/>
+        </w:rPr>
+        <w:t xml:space="preserve">Live Demo Video: </w:t>
+      </w:r>
+      <w:hyperlink r:id="rId7" w:history="1">
+        <w:r>
+          <w:rPr>
+            <w:rStyle w:val="Hyperlink"/>
+            <w:rFonts w:ascii="Calibri" w:hAnsi="Calibri"/>
+            <w:color w:val="1155CC"/>
+            <w:sz w:val="19"/>
+            <w:u w:val="single"/>
+          </w:rPr>
+          <w:t>youtube.com/watch?v=4rsPaYPXP2M</w:t>
+        </w:r>
+      </w:hyperlink>
+      <w:r>
+        <w:rPr>
+          <w:rFonts w:ascii="Calibri" w:hAnsi="Calibri"/>
+          <w:color w:val="444444"/>
+          <w:sz w:val="19"/>
+        </w:rPr>
+        <w:t xml:space="preserve">  |  </w:t>
+      </w:r>
+      <w:r>
+        <w:rPr>
+          <w:rFonts w:ascii="Calibri" w:hAnsi="Calibri"/>
+          <w:color w:val="444444"/>
+          <w:sz w:val="19"/>
+        </w:rPr>
+        <w:t xml:space="preserve">GitHub: </w:t>
+      </w:r>
+      <w:hyperlink r:id="rId8" w:history="1">
+        <w:r>
+          <w:rPr>
+            <w:rStyle w:val="Hyperlink"/>
+            <w:rFonts w:ascii="Calibri" w:hAnsi="Calibri"/>
+            <w:color w:val="1155CC"/>
+            <w:sz w:val="19"/>
+            <w:u w:val="single"/>
+          </w:rPr>
+          <w:t>github.com/teamvisioncraft875-netizen/CyberGuard</w:t>
+        </w:r>
+      </w:hyperlink>
+      <w:r>
+        <w:rPr>
+          <w:rFonts w:ascii="Calibri" w:hAnsi="Calibri"/>
+          <w:color w:val="444444"/>
+          <w:sz w:val="19"/>
+        </w:rPr>
+        <w:t xml:space="preserve">  |  </w:t>
+      </w:r>
+      <w:r>
+        <w:rPr>
+          <w:rFonts w:ascii="Calibri" w:hAnsi="Calibri"/>
+          <w:color w:val="444444"/>
+          <w:sz w:val="19"/>
+        </w:rPr>
+        <w:t xml:space="preserve">LinkedIn: </w:t>
+      </w:r>
+      <w:hyperlink r:id="rId9" w:history="1">
+        <w:r>
+          <w:rPr>
+            <w:rStyle w:val="Hyperlink"/>
+            <w:rFonts w:ascii="Calibri" w:hAnsi="Calibri"/>
+            <w:color w:val="1155CC"/>
+            <w:sz w:val="19"/>
+            <w:u w:val="single"/>
+          </w:rPr>
+          <w:t>lnkd.in/p/dwxKz3Rm</w:t>
+        </w:r>
+      </w:hyperlink>
+    </w:p>
+    <w:p>
+      <w:pPr>
+        <w:pStyle w:val="ListParagraph"/>
+        <w:numPr>
+          <w:ilvl w:val="0"/>
+          <w:numId w:val="1"/>
+        </w:numPr>
+        <w:spacing w:after="20"/>
+      </w:pPr>
+      <w:r>
+        <w:rPr>
+          <w:rFonts w:ascii="Calibri" w:hAnsi="Calibri"/>
+          <w:color w:val="1A1A1A"/>
+          <w:sz w:val="20"/>
+        </w:rPr>
+        <w:t>Architected an AI-native cybersecurity platform unifying threat detection, investigation, and SOAR response across individual users (Guard App) and enterprise security operations.</w:t>
+      </w:r>
+    </w:p>
+    <w:p>
+      <w:pPr>
+        <w:pStyle w:val="ListParagraph"/>
+        <w:numPr>
+          <w:ilvl w:val="0"/>
+          <w:numId w:val="1"/>
+        </w:numPr>
+        <w:spacing w:after="20"/>
+      </w:pPr>
+      <w:r>
+        <w:rPr>
+          <w:rFonts w:ascii="Calibri" w:hAnsi="Calibri"/>
+          <w:color w:val="1A1A1A"/>
+          <w:sz w:val="20"/>
+        </w:rPr>
+        <w:t>Led the AI/ML layer, developing and benchmarking detection engines: Phishing (calibrated LinearSVC), Malicious URL (HistGradientBoosting), Malware PE (LightGBM), and EDR anomaly (Random Forest).</w:t>
+      </w:r>
+    </w:p>
+    <w:p>
+      <w:pPr>
+        <w:pStyle w:val="ListParagraph"/>
+        <w:numPr>
+          <w:ilvl w:val="0"/>
+          <w:numId w:val="1"/>
+        </w:numPr>
+        <w:spacing w:after="20"/>
+      </w:pPr>
+      <w:r>
+        <w:rPr>
+          <w:rFonts w:ascii="Calibri" w:hAnsi="Calibri"/>
+          <w:color w:val="1A1A1A"/>
+          <w:sz w:val="20"/>
+        </w:rPr>
+        <w:t>Achieved benchmark results on held-out datasets: 99.59% phishing accuracy, 97.10% malware detection rate, 98.41% EDR threat recall on unseen host, and 99.65% incident correlation recall (CTU-13).</w:t>
+      </w:r>
+    </w:p>
+    <w:p>
+      <w:pPr>
+        <w:pStyle w:val="ListParagraph"/>
+        <w:numPr>
+          <w:ilvl w:val="0"/>
+          <w:numId w:val="1"/>
+        </w:numPr>
+        <w:spacing w:after="20"/>
+      </w:pPr>
+      <w:r>
+        <w:rPr>
+          <w:rFonts w:ascii="Calibri" w:hAnsi="Calibri"/>
+          <w:color w:val="1A1A1A"/>
+          <w:sz w:val="20"/>
+        </w:rPr>
+        <w:t>Enforced host-disjoint splits, strict no-synthetic-data policy, SHA-256 model registry verification, and safety guardrails requiring human analyst approval for destructive actions.</w:t>
+      </w:r>
+    </w:p>
+    <w:p>
+      <w:pPr>
+        <w:pStyle w:val="ListParagraph"/>
+        <w:numPr>
+          <w:ilvl w:val="0"/>
+          <w:numId w:val="1"/>
+        </w:numPr>
+        <w:spacing w:after="20"/>
+      </w:pPr>
+      <w:r>
+        <w:rPr>
+          <w:rFonts w:ascii="Calibri" w:hAnsi="Calibri"/>
+          <w:color w:val="1A1A1A"/>
+          <w:sz w:val="20"/>
+        </w:rPr>
+        <w:t>Exposed all engines via a FastAPI microservice with automated pytest validation, integrated with PostgreSQL RLS and RBAC.</w:t>
+      </w:r>
+    </w:p>
+    <w:p>
+      <w:pPr>
+        <w:spacing w:after="10" w:before="100"/>
       </w:pPr>
       <w:r>
         <w:rPr>
@@ -581,7 +804,7 @@
     </w:p>
     <w:p>
       <w:pPr>
-        <w:spacing w:after="40"/>
+        <w:spacing w:after="20"/>
       </w:pPr>
       <w:r>
         <w:rPr>
@@ -610,7 +833,7 @@
     </w:p>
     <w:p>
       <w:pPr>
-        <w:spacing w:after="40"/>
+        <w:spacing w:after="20"/>
       </w:pPr>
       <w:r>
         <w:rPr>
@@ -664,7 +887,7 @@
           <w:ilvl w:val="0"/>
           <w:numId w:val="1"/>
         </w:numPr>
-        <w:spacing w:after="40"/>
+        <w:spacing w:after="20"/>
       </w:pPr>
       <w:r>
         <w:rPr>
@@ -683,7 +906,7 @@
           <w:ilvl w:val="0"/>
           <w:numId w:val="1"/>
         </w:numPr>
-        <w:spacing w:after="40"/>
+        <w:spacing w:after="20"/>
       </w:pPr>
       <w:r>
         <w:rPr>
@@ -702,7 +925,7 @@
           <w:ilvl w:val="0"/>
           <w:numId w:val="1"/>
         </w:numPr>
-        <w:spacing w:after="40"/>
+        <w:spacing w:after="20"/>
       </w:pPr>
       <w:r>
         <w:rPr>
@@ -716,7 +939,7 @@
     </w:p>
     <w:p>
       <w:pPr>
-        <w:spacing w:after="10" w:before="140"/>
+        <w:spacing w:after="10" w:before="100"/>
       </w:pPr>
       <w:r>
         <w:rPr>
@@ -732,7 +955,7 @@
     </w:p>
     <w:p>
       <w:pPr>
-        <w:spacing w:after="40"/>
+        <w:spacing w:after="20"/>
       </w:pPr>
       <w:r>
         <w:rPr>
@@ -748,7 +971,7 @@
     </w:p>
     <w:p>
       <w:pPr>
-        <w:spacing w:after="40"/>
+        <w:spacing w:after="20"/>
       </w:pPr>
       <w:r>
         <w:rPr>
@@ -777,7 +1000,7 @@
     </w:p>
     <w:p>
       <w:pPr>
-        <w:spacing w:after="40"/>
+        <w:spacing w:after="20"/>
       </w:pPr>
       <w:r>
         <w:rPr>
@@ -809,7 +1032,7 @@
           <w:ilvl w:val="0"/>
           <w:numId w:val="1"/>
         </w:numPr>
-        <w:spacing w:after="40"/>
+        <w:spacing w:after="20"/>
       </w:pPr>
       <w:r>
         <w:rPr>
@@ -828,7 +1051,7 @@
           <w:ilvl w:val="0"/>
           <w:numId w:val="1"/>
         </w:numPr>
-        <w:spacing w:after="40"/>
+        <w:spacing w:after="20"/>
       </w:pPr>
       <w:r>
         <w:rPr>
@@ -847,7 +1070,7 @@
           <w:ilvl w:val="0"/>
           <w:numId w:val="1"/>
         </w:numPr>
-        <w:spacing w:after="40"/>
+        <w:spacing w:after="20"/>
       </w:pPr>
       <w:r>
         <w:rPr>
@@ -861,7 +1084,7 @@
     </w:p>
     <w:p>
       <w:pPr>
-        <w:spacing w:after="10" w:before="140"/>
+        <w:spacing w:after="10" w:before="100"/>
       </w:pPr>
       <w:r>
         <w:rPr>
@@ -877,7 +1100,7 @@
     </w:p>
     <w:p>
       <w:pPr>
-        <w:spacing w:after="40"/>
+        <w:spacing w:after="20"/>
       </w:pPr>
       <w:r>
         <w:rPr>
@@ -906,7 +1129,7 @@
     </w:p>
     <w:p>
       <w:pPr>
-        <w:spacing w:after="40"/>
+        <w:spacing w:after="20"/>
       </w:pPr>
       <w:r>
         <w:rPr>
@@ -960,7 +1183,7 @@
           <w:ilvl w:val="0"/>
           <w:numId w:val="1"/>
         </w:numPr>
-        <w:spacing w:after="40"/>
+        <w:spacing w:after="20"/>
       </w:pPr>
       <w:r>
         <w:rPr>
@@ -979,7 +1202,7 @@
           <w:ilvl w:val="0"/>
           <w:numId w:val="1"/>
         </w:numPr>
-        <w:spacing w:after="40"/>
+        <w:spacing w:after="20"/>
       </w:pPr>
       <w:r>
         <w:rPr>
@@ -993,7 +1216,7 @@
     </w:p>
     <w:p>
       <w:pPr>
-        <w:spacing w:after="10" w:before="140"/>
+        <w:spacing w:after="10" w:before="100"/>
       </w:pPr>
       <w:r>
         <w:rPr>
@@ -1009,7 +1232,7 @@
     </w:p>
     <w:p>
       <w:pPr>
-        <w:spacing w:after="40"/>
+        <w:spacing w:after="20"/>
       </w:pPr>
       <w:r>
         <w:rPr>
@@ -1043,7 +1266,7 @@
           <w:ilvl w:val="0"/>
           <w:numId w:val="1"/>
         </w:numPr>
-        <w:spacing w:after="40"/>
+        <w:spacing w:after="20"/>
       </w:pPr>
       <w:r>
         <w:rPr>
@@ -1062,7 +1285,7 @@
           <w:ilvl w:val="0"/>
           <w:numId w:val="1"/>
         </w:numPr>
-        <w:spacing w:after="40"/>
+        <w:spacing w:after="20"/>
       </w:pPr>
       <w:r>
         <w:rPr>
@@ -1076,7 +1299,7 @@
     </w:p>
     <w:p>
       <w:pPr>
-        <w:spacing w:after="10" w:before="140"/>
+        <w:spacing w:after="10" w:before="100"/>
       </w:pPr>
       <w:r>
         <w:rPr>
@@ -1092,7 +1315,7 @@
     </w:p>
     <w:p>
       <w:pPr>
-        <w:spacing w:after="40"/>
+        <w:spacing w:after="20"/>
       </w:pPr>
       <w:r>
         <w:rPr>
@@ -1126,7 +1349,7 @@
           <w:ilvl w:val="0"/>
           <w:numId w:val="1"/>
         </w:numPr>
-        <w:spacing w:after="40"/>
+        <w:spacing w:after="20"/>
       </w:pPr>
       <w:r>
         <w:rPr>
@@ -1140,7 +1363,7 @@
     </w:p>
     <w:p>
       <w:pPr>
-        <w:spacing w:after="10" w:before="140"/>
+        <w:spacing w:after="10" w:before="100"/>
       </w:pPr>
       <w:r>
         <w:rPr>
@@ -1156,7 +1379,7 @@
     </w:p>
     <w:p>
       <w:pPr>
-        <w:spacing w:after="40"/>
+        <w:spacing w:after="20"/>
       </w:pPr>
       <w:r>
         <w:rPr>
@@ -1190,7 +1413,7 @@
           <w:ilvl w:val="0"/>
           <w:numId w:val="1"/>
         </w:numPr>
-        <w:spacing w:after="40"/>
+        <w:spacing w:after="20"/>
       </w:pPr>
       <w:r>
         <w:rPr>
@@ -1204,7 +1427,7 @@
     </w:p>
     <w:p>
       <w:pPr>
-        <w:spacing w:after="10" w:before="140"/>
+        <w:spacing w:after="10" w:before="100"/>
       </w:pPr>
       <w:r>
         <w:rPr>
@@ -1220,7 +1443,7 @@
     </w:p>
     <w:p>
       <w:pPr>
-        <w:spacing w:after="40"/>
+        <w:spacing w:after="20"/>
       </w:pPr>
       <w:r>
         <w:rPr>
@@ -1254,7 +1477,7 @@
           <w:ilvl w:val="0"/>
           <w:numId w:val="1"/>
         </w:numPr>
-        <w:spacing w:after="40"/>
+        <w:spacing w:after="20"/>
       </w:pPr>
       <w:r>
         <w:rPr>
@@ -1271,7 +1494,7 @@
         <w:pBdr>
           <w:bottom w:val="single" w:color="1F6F3F" w:sz="6" w:space="2"/>
         </w:pBdr>
-        <w:spacing w:after="90" w:before="190"/>
+        <w:spacing w:after="60" w:before="100"/>
       </w:pPr>
       <w:r>
         <w:rPr>
@@ -1287,7 +1510,7 @@
     </w:p>
     <w:p>
       <w:pPr>
-        <w:spacing w:after="60"/>
+        <w:spacing w:after="20"/>
       </w:pPr>
       <w:r>
         <w:rPr>
@@ -1312,7 +1535,7 @@
     </w:p>
     <w:p>
       <w:pPr>
-        <w:spacing w:after="60"/>
+        <w:spacing w:after="20"/>
       </w:pPr>
       <w:r>
         <w:rPr>
@@ -1337,7 +1560,7 @@
     </w:p>
     <w:p>
       <w:pPr>
-        <w:spacing w:after="60"/>
+        <w:spacing w:after="20"/>
       </w:pPr>
       <w:r>
         <w:rPr>
@@ -1362,7 +1585,7 @@
     </w:p>
     <w:p>
       <w:pPr>
-        <w:spacing w:after="60"/>
+        <w:spacing w:after="20"/>
       </w:pPr>
       <w:r>
         <w:rPr>
@@ -1387,7 +1610,7 @@
     </w:p>
     <w:p>
       <w:pPr>
-        <w:spacing w:after="60"/>
+        <w:spacing w:after="20"/>
       </w:pPr>
       <w:r>
         <w:rPr>
@@ -1412,7 +1635,7 @@
     </w:p>
     <w:p>
       <w:pPr>
-        <w:spacing w:after="60"/>
+        <w:spacing w:after="20"/>
       </w:pPr>
       <w:r>
         <w:rPr>
@@ -1437,7 +1660,7 @@
     </w:p>
     <w:p>
       <w:pPr>
-        <w:spacing w:after="60"/>
+        <w:spacing w:after="20"/>
       </w:pPr>
       <w:r>
         <w:rPr>
@@ -1462,7 +1685,7 @@
     </w:p>
     <w:p>
       <w:pPr>
-        <w:spacing w:after="60"/>
+        <w:spacing w:after="20"/>
       </w:pPr>
       <w:r>
         <w:rPr>
@@ -1490,7 +1713,7 @@
         <w:pBdr>
           <w:bottom w:val="single" w:color="1F6F3F" w:sz="6" w:space="2"/>
         </w:pBdr>
-        <w:spacing w:after="90" w:before="190"/>
+        <w:spacing w:after="60" w:before="100"/>
       </w:pPr>
       <w:r>
         <w:rPr>
@@ -1536,24 +1759,10 @@
     </w:p>
     <w:p>
       <w:pPr>
-        <w:spacing w:after="120"/>
-      </w:pPr>
-      <w:r>
-        <w:rPr>
-          <w:rFonts w:ascii="Calibri" w:cs="Calibri" w:eastAsia="Calibri" w:hAnsi="Calibri"/>
-          <w:color w:val="444444"/>
-          <w:sz w:val="20"/>
-          <w:szCs w:val="20"/>
-        </w:rPr>
-        <w:t xml:space="preserve">Current Status: Pursuing 5th Semester   |   CGPA: 8.95/10 (up to 4th Semester)</w:t>
-      </w:r>
-    </w:p>
-    <w:p>
-      <w:pPr>
         <w:pBdr>
           <w:bottom w:val="single" w:color="1F6F3F" w:sz="6" w:space="2"/>
         </w:pBdr>
-        <w:spacing w:after="90" w:before="190"/>
+        <w:spacing w:after="60" w:before="100"/>
       </w:pPr>
       <w:r>
         <w:rPr>
@@ -1574,7 +1783,7 @@
           <w:ilvl w:val="0"/>
           <w:numId w:val="1"/>
         </w:numPr>
-        <w:spacing w:after="40"/>
+        <w:spacing w:after="20"/>
       </w:pPr>
       <w:r>
         <w:rPr>
@@ -1593,7 +1802,7 @@
           <w:ilvl w:val="0"/>
           <w:numId w:val="1"/>
         </w:numPr>
-        <w:spacing w:after="40"/>
+        <w:spacing w:after="20"/>
       </w:pPr>
       <w:r>
         <w:rPr>
@@ -1612,7 +1821,7 @@
           <w:ilvl w:val="0"/>
           <w:numId w:val="1"/>
         </w:numPr>
-        <w:spacing w:after="40"/>
+        <w:spacing w:after="20"/>
       </w:pPr>
       <w:r>
         <w:rPr>
@@ -1631,7 +1840,7 @@
           <w:ilvl w:val="0"/>
           <w:numId w:val="1"/>
         </w:numPr>
-        <w:spacing w:after="40"/>
+        <w:spacing w:after="20"/>
       </w:pPr>
       <w:r>
         <w:rPr>
@@ -1650,45 +1859,20 @@
           <w:ilvl w:val="0"/>
           <w:numId w:val="1"/>
         </w:numPr>
-        <w:spacing w:after="40"/>
-      </w:pPr>
-      <w:r>
-        <w:rPr>
-          <w:rFonts w:ascii="Calibri" w:cs="Calibri" w:eastAsia="Calibri" w:hAnsi="Calibri"/>
-          <w:color w:val="1A1A1A"/>
-          <w:sz w:val="20"/>
-          <w:szCs w:val="20"/>
-        </w:rPr>
-        <w:t xml:space="preserve">Python (HackerRank)</w:t>
-      </w:r>
-    </w:p>
-    <w:p>
-      <w:pPr>
-        <w:pStyle w:val="ListParagraph"/>
-        <w:numPr>
-          <w:ilvl w:val="0"/>
-          <w:numId w:val="1"/>
-        </w:numPr>
-        <w:spacing w:after="40"/>
-      </w:pPr>
-      <w:r>
-        <w:rPr>
-          <w:rFonts w:ascii="Calibri" w:cs="Calibri" w:eastAsia="Calibri" w:hAnsi="Calibri"/>
-          <w:color w:val="1A1A1A"/>
-          <w:sz w:val="20"/>
-          <w:szCs w:val="20"/>
-        </w:rPr>
-        <w:t xml:space="preserve">Java (HackerRank)</w:t>
-      </w:r>
-    </w:p>
-    <w:p>
-      <w:pPr>
-        <w:pStyle w:val="ListParagraph"/>
-        <w:numPr>
-          <w:ilvl w:val="0"/>
-          <w:numId w:val="1"/>
-        </w:numPr>
-        <w:spacing w:after="40"/>
+        <w:spacing w:after="20"/>
+      </w:pPr>
+      <w:r>
+        <w:t>Python &amp; Java (HackerRank)</w:t>
+      </w:r>
+    </w:p>
+    <w:p>
+      <w:pPr>
+        <w:pStyle w:val="ListParagraph"/>
+        <w:numPr>
+          <w:ilvl w:val="0"/>
+          <w:numId w:val="1"/>
+        </w:numPr>
+        <w:spacing w:after="20"/>
       </w:pPr>
       <w:r>
         <w:rPr>
@@ -1707,45 +1891,20 @@
           <w:ilvl w:val="0"/>
           <w:numId w:val="1"/>
         </w:numPr>
-        <w:spacing w:after="40"/>
-      </w:pPr>
-      <w:r>
-        <w:rPr>
-          <w:rFonts w:ascii="Calibri" w:cs="Calibri" w:eastAsia="Calibri" w:hAnsi="Calibri"/>
-          <w:color w:val="1A1A1A"/>
-          <w:sz w:val="20"/>
-          <w:szCs w:val="20"/>
-        </w:rPr>
-        <w:t xml:space="preserve">IBM Git &amp; GitHub</w:t>
-      </w:r>
-    </w:p>
-    <w:p>
-      <w:pPr>
-        <w:pStyle w:val="ListParagraph"/>
-        <w:numPr>
-          <w:ilvl w:val="0"/>
-          <w:numId w:val="1"/>
-        </w:numPr>
-        <w:spacing w:after="40"/>
-      </w:pPr>
-      <w:r>
-        <w:rPr>
-          <w:rFonts w:ascii="Calibri" w:cs="Calibri" w:eastAsia="Calibri" w:hAnsi="Calibri"/>
-          <w:color w:val="1A1A1A"/>
-          <w:sz w:val="20"/>
-          <w:szCs w:val="20"/>
-        </w:rPr>
-        <w:t xml:space="preserve">IBM Microsoft Office</w:t>
-      </w:r>
-    </w:p>
-    <w:p>
-      <w:pPr>
-        <w:pStyle w:val="ListParagraph"/>
-        <w:numPr>
-          <w:ilvl w:val="0"/>
-          <w:numId w:val="1"/>
-        </w:numPr>
-        <w:spacing w:after="40"/>
+        <w:spacing w:after="20"/>
+      </w:pPr>
+      <w:r>
+        <w:t>IBM — Frontend Development, Git &amp; GitHub, Microsoft Office</w:t>
+      </w:r>
+    </w:p>
+    <w:p>
+      <w:pPr>
+        <w:pStyle w:val="ListParagraph"/>
+        <w:numPr>
+          <w:ilvl w:val="0"/>
+          <w:numId w:val="1"/>
+        </w:numPr>
+        <w:spacing w:after="20"/>
       </w:pPr>
       <w:r>
         <w:rPr>
@@ -1755,25 +1914,6 @@
           <w:szCs w:val="20"/>
         </w:rPr>
         <w:t xml:space="preserve">Simplilearn Google Workshop</w:t>
-      </w:r>
-    </w:p>
-    <w:p>
-      <w:pPr>
-        <w:pStyle w:val="ListParagraph"/>
-        <w:numPr>
-          <w:ilvl w:val="0"/>
-          <w:numId w:val="1"/>
-        </w:numPr>
-        <w:spacing w:after="40"/>
-      </w:pPr>
-      <w:r>
-        <w:rPr>
-          <w:rFonts w:ascii="Calibri" w:cs="Calibri" w:eastAsia="Calibri" w:hAnsi="Calibri"/>
-          <w:color w:val="1A1A1A"/>
-          <w:sz w:val="20"/>
-          <w:szCs w:val="20"/>
-        </w:rPr>
-        <w:t xml:space="preserve">AINCAT 2026 — Certificate of Participation</w:t>
       </w:r>
     </w:p>
     <w:p>
@@ -1781,7 +1921,7 @@
         <w:pBdr>
           <w:bottom w:val="single" w:color="1F6F3F" w:sz="6" w:space="2"/>
         </w:pBdr>
-        <w:spacing w:after="90" w:before="190"/>
+        <w:spacing w:after="60" w:before="100"/>
       </w:pPr>
       <w:r>
         <w:rPr>
@@ -1802,7 +1942,7 @@
           <w:ilvl w:val="0"/>
           <w:numId w:val="1"/>
         </w:numPr>
-        <w:spacing w:after="40"/>
+        <w:spacing w:after="20"/>
       </w:pPr>
       <w:r>
         <w:rPr>
@@ -1821,7 +1961,7 @@
           <w:ilvl w:val="0"/>
           <w:numId w:val="1"/>
         </w:numPr>
-        <w:spacing w:after="40"/>
+        <w:spacing w:after="20"/>
       </w:pPr>
       <w:r>
         <w:rPr>
@@ -1840,7 +1980,7 @@
           <w:ilvl w:val="0"/>
           <w:numId w:val="1"/>
         </w:numPr>
-        <w:spacing w:after="40"/>
+        <w:spacing w:after="20"/>
       </w:pPr>
       <w:r>
         <w:rPr>
@@ -1859,7 +1999,7 @@
           <w:ilvl w:val="0"/>
           <w:numId w:val="1"/>
         </w:numPr>
-        <w:spacing w:after="40"/>
+        <w:spacing w:after="20"/>
       </w:pPr>
       <w:r>
         <w:rPr>
@@ -1878,7 +2018,7 @@
           <w:ilvl w:val="0"/>
           <w:numId w:val="1"/>
         </w:numPr>
-        <w:spacing w:after="40"/>
+        <w:spacing w:after="20"/>
       </w:pPr>
       <w:r>
         <w:rPr>
@@ -1897,7 +2037,7 @@
           <w:ilvl w:val="0"/>
           <w:numId w:val="1"/>
         </w:numPr>
-        <w:spacing w:after="40"/>
+        <w:spacing w:after="20"/>
       </w:pPr>
       <w:r>
         <w:rPr>
@@ -1914,7 +2054,7 @@
         <w:pBdr>
           <w:bottom w:val="single" w:color="1F6F3F" w:sz="6" w:space="2"/>
         </w:pBdr>
-        <w:spacing w:after="90" w:before="190"/>
+        <w:spacing w:after="60" w:before="100"/>
       </w:pPr>
       <w:r>
         <w:rPr>
@@ -1944,7 +2084,7 @@
     </w:p>
     <w:sectPr>
       <w:pgSz w:w="12240" w:h="15840" w:orient="portrait"/>
-      <w:pgMar w:top="460" w:right="620" w:bottom="460" w:left="620" w:header="708" w:footer="708" w:gutter="0"/>
+      <w:pgMar w:top="360" w:right="560" w:bottom="360" w:left="560" w:header="708" w:footer="708" w:gutter="0"/>
       <w:pgNumType/>
       <w:docGrid w:linePitch="360"/>
     </w:sectPr>

</xml_diff>